<commit_message>
Leakage note: erasure-qubit section (sections 73-74), six tests, English and Spanish PDF and Word
</commit_message>
<xml_diff>
--- a/manuscript/qang_fuga.docx
+++ b/manuscript/qang_fuga.docx
@@ -49,7 +49,19 @@
         <w:t xml:space="preserve"> </w:t>
       </w:r>
       <w:r>
-        <w:t xml:space="preserve">flags</w:t>
+        <w:t xml:space="preserve">flags,</w:t>
+      </w:r>
+      <w:r>
+        <w:t xml:space="preserve"> </w:t>
+      </w:r>
+      <w:r>
+        <w:t xml:space="preserve">erasure</w:t>
+      </w:r>
+      <w:r>
+        <w:t xml:space="preserve"> </w:t>
+      </w:r>
+      <w:r>
+        <w:t xml:space="preserve">qubits</w:t>
       </w:r>
       <w:r>
         <w:t xml:space="preserve"> </w:t>
@@ -167,7 +179,7 @@
         <w:t xml:space="preserve">Keywords: </w:t>
       </w:r>
       <w:r>
-        <w:t>Leakage, Qutrit readout, Surface code, Erasure decoding, Minimum-weight perfect matching, Amplitude damping (T1)</w:t>
+        <w:t>Leakage, Qutrit readout, Erasure qubits, Surface code, Erasure decoding, Amplitude damping (T1)</w:t>
       </w:r>
     </w:p>
     <w:p>
@@ -485,7 +497,7 @@
         <w:t xml:space="preserve"> </w:t>
       </w:r>
       <w:r>
-        <w:t xml:space="preserve">Four</w:t>
+        <w:t xml:space="preserve">Six</w:t>
       </w:r>
       <w:r>
         <w:t xml:space="preserve"> </w:t>
@@ -1679,6 +1691,388 @@
         <w:t xml:space="preserve"> </w:t>
       </w:r>
       <w:r>
+        <w:t xml:space="preserve">(v)</w:t>
+      </w:r>
+      <w:r>
+        <w:t xml:space="preserve"> </w:t>
+      </w:r>
+      <w:r>
+        <w:t xml:space="preserve">On</w:t>
+      </w:r>
+      <w:r>
+        <w:t xml:space="preserve"> </w:t>
+      </w:r>
+      <w:r>
+        <w:t xml:space="preserve">erasure</w:t>
+      </w:r>
+      <w:r>
+        <w:t xml:space="preserve"> </w:t>
+      </w:r>
+      <w:r>
+        <w:t xml:space="preserve">qubits,</w:t>
+      </w:r>
+      <w:r>
+        <w:t xml:space="preserve"> </w:t>
+      </w:r>
+      <w:r>
+        <w:t xml:space="preserve">which</w:t>
+      </w:r>
+      <w:r>
+        <w:t xml:space="preserve"> </w:t>
+      </w:r>
+      <w:r>
+        <w:t xml:space="preserve">herald</w:t>
+      </w:r>
+      <w:r>
+        <w:t xml:space="preserve"> </w:t>
+      </w:r>
+      <w:r>
+        <w:t xml:space="preserve">T1</w:t>
+      </w:r>
+      <w:r>
+        <w:t xml:space="preserve"> </w:t>
+      </w:r>
+      <w:r>
+        <w:t xml:space="preserve">decays</w:t>
+      </w:r>
+      <w:r>
+        <w:t xml:space="preserve"> </w:t>
+      </w:r>
+      <w:r>
+        <w:t xml:space="preserve">as</w:t>
+      </w:r>
+      <w:r>
+        <w:t xml:space="preserve"> </w:t>
+      </w:r>
+      <w:r>
+        <w:t xml:space="preserve">they</w:t>
+      </w:r>
+      <w:r>
+        <w:t xml:space="preserve"> </w:t>
+      </w:r>
+      <w:r>
+        <w:t xml:space="preserve">happen,</w:t>
+      </w:r>
+      <w:r>
+        <w:t xml:space="preserve"> </w:t>
+      </w:r>
+      <w:r>
+        <w:t xml:space="preserve">a</w:t>
+      </w:r>
+      <w:r>
+        <w:t xml:space="preserve"> </w:t>
+      </w:r>
+      <w:r>
+        <w:t xml:space="preserve">naive</w:t>
+      </w:r>
+      <w:r>
+        <w:t xml:space="preserve"> </w:t>
+      </w:r>
+      <w:r>
+        <w:t xml:space="preserve">combination</w:t>
+      </w:r>
+      <w:r>
+        <w:t xml:space="preserve"> </w:t>
+      </w:r>
+      <w:r>
+        <w:t xml:space="preserve">with</w:t>
+      </w:r>
+      <w:r>
+        <w:t xml:space="preserve"> </w:t>
+      </w:r>
+      <w:r>
+        <w:t xml:space="preserve">qg</w:t>
+      </w:r>
+      <w:r>
+        <w:t xml:space="preserve"> </w:t>
+      </w:r>
+      <w:r>
+        <w:t xml:space="preserve">is</w:t>
+      </w:r>
+      <w:r>
+        <w:t xml:space="preserve"> </w:t>
+      </w:r>
+      <w:r>
+        <w:t xml:space="preserve">harmful</w:t>
+      </w:r>
+      <w:r>
+        <w:t xml:space="preserve"> </w:t>
+      </w:r>
+      <w:r>
+        <w:t xml:space="preserve">when</w:t>
+      </w:r>
+      <w:r>
+        <w:t xml:space="preserve"> </w:t>
+      </w:r>
+      <w:r>
+        <w:t xml:space="preserve">heralding</w:t>
+      </w:r>
+      <w:r>
+        <w:t xml:space="preserve"> </w:t>
+      </w:r>
+      <w:r>
+        <w:t xml:space="preserve">is</w:t>
+      </w:r>
+      <w:r>
+        <w:t xml:space="preserve"> </w:t>
+      </w:r>
+      <w:r>
+        <w:t xml:space="preserve">good</w:t>
+      </w:r>
+      <w:r>
+        <w:t xml:space="preserve"> </w:t>
+      </w:r>
+      <w:r>
+        <w:t xml:space="preserve">(0.46</w:t>
+      </w:r>
+      <m:oMath>
+        <m:r>
+          <m:rPr>
+            <m:sty m:val="p"/>
+          </m:rPr>
+          <m:t>×</m:t>
+        </m:r>
+      </m:oMath>
+      <w:r>
+        <w:t xml:space="preserve"> </w:t>
+      </w:r>
+      <w:r>
+        <w:t xml:space="preserve">at</w:t>
+      </w:r>
+      <w:r>
+        <w:t xml:space="preserve"> </w:t>
+      </w:r>
+      <w:r>
+        <w:t xml:space="preserve">heralding</w:t>
+      </w:r>
+      <w:r>
+        <w:t xml:space="preserve"> </w:t>
+      </w:r>
+      <w:r>
+        <w:t xml:space="preserve">efficiency</w:t>
+      </w:r>
+      <w:r>
+        <w:t xml:space="preserve"> </w:t>
+      </w:r>
+      <m:oMath>
+        <m:r>
+          <m:t>h</m:t>
+        </m:r>
+        <m:r>
+          <m:rPr>
+            <m:sty m:val="p"/>
+          </m:rPr>
+          <m:t>=</m:t>
+        </m:r>
+        <m:r>
+          <m:t>0.99</m:t>
+        </m:r>
+      </m:oMath>
+      <w:r>
+        <w:t xml:space="preserve">);</w:t>
+      </w:r>
+      <w:r>
+        <w:t xml:space="preserve"> </w:t>
+      </w:r>
+      <w:r>
+        <w:t xml:space="preserve">scaling</w:t>
+      </w:r>
+      <w:r>
+        <w:t xml:space="preserve"> </w:t>
+      </w:r>
+      <w:r>
+        <w:t xml:space="preserve">the</w:t>
+      </w:r>
+      <w:r>
+        <w:t xml:space="preserve"> </w:t>
+      </w:r>
+      <w:r>
+        <w:t xml:space="preserve">prior</w:t>
+      </w:r>
+      <w:r>
+        <w:t xml:space="preserve"> </w:t>
+      </w:r>
+      <w:r>
+        <w:t xml:space="preserve">of</w:t>
+      </w:r>
+      <w:r>
+        <w:t xml:space="preserve"> </w:t>
+      </w:r>
+      <w:r>
+        <w:t xml:space="preserve">unheralded</w:t>
+      </w:r>
+      <w:r>
+        <w:t xml:space="preserve"> </w:t>
+      </w:r>
+      <w:r>
+        <w:t xml:space="preserve">decays</w:t>
+      </w:r>
+      <w:r>
+        <w:t xml:space="preserve"> </w:t>
+      </w:r>
+      <w:r>
+        <w:t xml:space="preserve">by</w:t>
+      </w:r>
+      <w:r>
+        <w:t xml:space="preserve"> </w:t>
+      </w:r>
+      <m:oMath>
+        <m:r>
+          <m:t>1</m:t>
+        </m:r>
+        <m:r>
+          <m:rPr>
+            <m:sty m:val="p"/>
+          </m:rPr>
+          <m:t>−</m:t>
+        </m:r>
+        <m:r>
+          <m:t>h</m:t>
+        </m:r>
+      </m:oMath>
+      <w:r>
+        <w:t xml:space="preserve">,</w:t>
+      </w:r>
+      <w:r>
+        <w:t xml:space="preserve"> </w:t>
+      </w:r>
+      <w:r>
+        <w:t xml:space="preserve">a</w:t>
+      </w:r>
+      <w:r>
+        <w:t xml:space="preserve"> </w:t>
+      </w:r>
+      <w:r>
+        <w:t xml:space="preserve">rule</w:t>
+      </w:r>
+      <w:r>
+        <w:t xml:space="preserve"> </w:t>
+      </w:r>
+      <w:r>
+        <w:t xml:space="preserve">then</w:t>
+      </w:r>
+      <w:r>
+        <w:t xml:space="preserve"> </w:t>
+      </w:r>
+      <w:r>
+        <w:t xml:space="preserve">tested</w:t>
+      </w:r>
+      <w:r>
+        <w:t xml:space="preserve"> </w:t>
+      </w:r>
+      <w:r>
+        <w:t xml:space="preserve">with</w:t>
+      </w:r>
+      <w:r>
+        <w:t xml:space="preserve"> </w:t>
+      </w:r>
+      <w:r>
+        <w:t xml:space="preserve">its</w:t>
+      </w:r>
+      <w:r>
+        <w:t xml:space="preserve"> </w:t>
+      </w:r>
+      <w:r>
+        <w:t xml:space="preserve">own</w:t>
+      </w:r>
+      <w:r>
+        <w:t xml:space="preserve"> </w:t>
+      </w:r>
+      <w:r>
+        <w:t xml:space="preserve">pre-registration,</w:t>
+      </w:r>
+      <w:r>
+        <w:t xml:space="preserve"> </w:t>
+      </w:r>
+      <w:r>
+        <w:t xml:space="preserve">removes</w:t>
+      </w:r>
+      <w:r>
+        <w:t xml:space="preserve"> </w:t>
+      </w:r>
+      <w:r>
+        <w:t xml:space="preserve">the</w:t>
+      </w:r>
+      <w:r>
+        <w:t xml:space="preserve"> </w:t>
+      </w:r>
+      <w:r>
+        <w:t xml:space="preserve">loss</w:t>
+      </w:r>
+      <w:r>
+        <w:t xml:space="preserve"> </w:t>
+      </w:r>
+      <w:r>
+        <w:t xml:space="preserve">and</w:t>
+      </w:r>
+      <w:r>
+        <w:t xml:space="preserve"> </w:t>
+      </w:r>
+      <w:r>
+        <w:t xml:space="preserve">keeps</w:t>
+      </w:r>
+      <w:r>
+        <w:t xml:space="preserve"> </w:t>
+      </w:r>
+      <w:r>
+        <w:t xml:space="preserve">a</w:t>
+      </w:r>
+      <w:r>
+        <w:t xml:space="preserve"> </w:t>
+      </w:r>
+      <w:r>
+        <w:t xml:space="preserve">gain</w:t>
+      </w:r>
+      <w:r>
+        <w:t xml:space="preserve"> </w:t>
+      </w:r>
+      <w:r>
+        <w:t xml:space="preserve">of</w:t>
+      </w:r>
+      <w:r>
+        <w:t xml:space="preserve"> </w:t>
+      </w:r>
+      <w:r>
+        <w:t xml:space="preserve">1.41–1.68</w:t>
+      </w:r>
+      <m:oMath>
+        <m:r>
+          <m:rPr>
+            <m:sty m:val="p"/>
+          </m:rPr>
+          <m:t>×</m:t>
+        </m:r>
+      </m:oMath>
+      <w:r>
+        <w:t xml:space="preserve"> </w:t>
+      </w:r>
+      <w:r>
+        <w:t xml:space="preserve">at</w:t>
+      </w:r>
+      <w:r>
+        <w:t xml:space="preserve"> </w:t>
+      </w:r>
+      <m:oMath>
+        <m:r>
+          <m:t>h</m:t>
+        </m:r>
+        <m:r>
+          <m:rPr>
+            <m:sty m:val="p"/>
+          </m:rPr>
+          <m:t>=</m:t>
+        </m:r>
+        <m:r>
+          <m:t>0.5</m:t>
+        </m:r>
+      </m:oMath>
+      <w:r>
+        <w:t xml:space="preserve">.</w:t>
+      </w:r>
+      <w:r>
+        <w:t xml:space="preserve"> </w:t>
+      </w:r>
+      <w:r>
         <w:t xml:space="preserve">All</w:t>
       </w:r>
       <w:r>
@@ -2629,7 +3023,7 @@
         <w:t xml:space="preserve"> </w:t>
       </w:r>
       <w:r>
-        <w:t xml:space="preserve">Each test states its criterion in the script before the run. For the last three,</w:t>
+        <w:t xml:space="preserve">Each test states its criterion in the script before the run. For the last five,</w:t>
       </w:r>
       <w:r>
         <w:t xml:space="preserve"> </w:t>
@@ -2677,17 +3071,41 @@
         <w:t xml:space="preserve">092580f</w:t>
       </w:r>
       <w:r>
-        <w:t xml:space="preserve">), and the code was debugged on a</w:t>
-      </w:r>
-      <w:r>
-        <w:t xml:space="preserve"> </w:t>
-      </w:r>
-      <w:r>
-        <w:t xml:space="preserve">different seed.</w:t>
+        <w:t xml:space="preserve">,</w:t>
+      </w:r>
+      <w:r>
+        <w:t xml:space="preserve"> </w:t>
+      </w:r>
+      <w:r>
+        <w:rPr>
+          <w:rStyle w:val="VerbatimChar"/>
+        </w:rPr>
+        <w:t xml:space="preserve">e877a72</w:t>
+      </w:r>
+      <w:r>
+        <w:t xml:space="preserve">,</w:t>
+      </w:r>
+      <w:r>
+        <w:t xml:space="preserve"> </w:t>
+      </w:r>
+      <w:r>
+        <w:rPr>
+          <w:rStyle w:val="VerbatimChar"/>
+        </w:rPr>
+        <w:t xml:space="preserve">68d8d00</w:t>
+      </w:r>
+      <w:r>
+        <w:t xml:space="preserve">),</w:t>
+      </w:r>
+      <w:r>
+        <w:t xml:space="preserve"> </w:t>
+      </w:r>
+      <w:r>
+        <w:t xml:space="preserve">and the code was debugged on a different seed.</w:t>
       </w:r>
     </w:p>
     <w:bookmarkEnd w:id="21"/>
-    <w:bookmarkStart w:id="32" w:name="results"/>
+    <w:bookmarkStart w:id="34" w:name="results"/>
     <w:p>
       <w:pPr>
         <w:pStyle w:val="Heading1"/>
@@ -8158,14 +8576,13 @@
     </w:tbl>
     <w:bookmarkEnd w:id="30"/>
     <w:bookmarkEnd w:id="31"/>
-    <w:bookmarkEnd w:id="32"/>
-    <w:bookmarkStart w:id="33" w:name="what-decides-it"/>
+    <w:bookmarkStart w:id="33" w:name="sec:erasure"/>
     <w:p>
       <w:pPr>
-        <w:pStyle w:val="Heading1"/>
+        <w:pStyle w:val="Heading2"/>
       </w:pPr>
       <w:r>
-        <w:t xml:space="preserve">What decides it</w:t>
+        <w:t xml:space="preserve">Erasure qubits</w:t>
       </w:r>
     </w:p>
     <w:p>
@@ -8173,7 +8590,1359 @@
         <w:pStyle w:val="FirstParagraph"/>
       </w:pPr>
       <w:r>
-        <w:t xml:space="preserve">The four tests fit one picture. Whether a three-level readout helps is decided by two properties of</w:t>
+        <w:t xml:space="preserve">Erasure qubits, such as dual-rail transmons </w:t>
+      </w:r>
+      <w:r>
+        <w:t xml:space="preserve">[10]</w:t>
+      </w:r>
+      <w:r>
+        <w:t xml:space="preserve"> </w:t>
+      </w:r>
+      <w:r>
+        <w:t xml:space="preserve">and atoms with erasure</w:t>
+      </w:r>
+      <w:r>
+        <w:t xml:space="preserve"> </w:t>
+      </w:r>
+      <w:r>
+        <w:t xml:space="preserve">conversion </w:t>
+      </w:r>
+      <w:r>
+        <w:t xml:space="preserve">[6]</w:t>
+      </w:r>
+      <w:r>
+        <w:t xml:space="preserve">, herald decay events as they happen. If heralding were perfect, the</w:t>
+      </w:r>
+      <w:r>
+        <w:t xml:space="preserve"> </w:t>
+      </w:r>
+      <w:r>
+        <w:t xml:space="preserve">final-readout bias that the qg decoder uses would carry nothing extra. We modelled this on the same</w:t>
+      </w:r>
+      <w:r>
+        <w:t xml:space="preserve"> </w:t>
+      </w:r>
+      <w:r>
+        <w:t xml:space="preserve">memory without leakage: every data-qubit decay</w:t>
+      </w:r>
+      <w:r>
+        <w:t xml:space="preserve"> </w:t>
+      </w:r>
+      <m:oMath>
+        <m:r>
+          <m:t>1</m:t>
+        </m:r>
+        <m:r>
+          <m:rPr>
+            <m:sty m:val="p"/>
+          </m:rPr>
+          <m:t>→</m:t>
+        </m:r>
+        <m:r>
+          <m:t>0</m:t>
+        </m:r>
+      </m:oMath>
+      <w:r>
+        <w:t xml:space="preserve"> </w:t>
+      </w:r>
+      <w:r>
+        <w:t xml:space="preserve">is heralded with probability</w:t>
+      </w:r>
+      <w:r>
+        <w:t xml:space="preserve"> </w:t>
+      </w:r>
+      <m:oMath>
+        <m:r>
+          <m:t>h</m:t>
+        </m:r>
+      </m:oMath>
+      <w:r>
+        <w:t xml:space="preserve"> </w:t>
+      </w:r>
+      <w:r>
+        <w:t xml:space="preserve">at its exact</w:t>
+      </w:r>
+      <w:r>
+        <w:t xml:space="preserve"> </w:t>
+      </w:r>
+      <w:r>
+        <w:t xml:space="preserve">location, and the erasure decoder sets that edge to probability</w:t>
+      </w:r>
+      <w:r>
+        <w:t xml:space="preserve"> </w:t>
+      </w:r>
+      <m:oMath>
+        <m:r>
+          <m:t>1</m:t>
+        </m:r>
+        <m:r>
+          <m:rPr>
+            <m:sty m:val="p"/>
+          </m:rPr>
+          <m:t>/</m:t>
+        </m:r>
+        <m:r>
+          <m:t>2</m:t>
+        </m:r>
+      </m:oMath>
+      <w:r>
+        <w:t xml:space="preserve">.</w:t>
+      </w:r>
+    </w:p>
+    <w:p>
+      <w:pPr>
+        <w:pStyle w:val="BodyText"/>
+      </w:pPr>
+      <w:r>
+        <w:t xml:space="preserve">The first test predicted that the gain of qg + erasure over erasure would fall with</w:t>
+      </w:r>
+      <w:r>
+        <w:t xml:space="preserve"> </w:t>
+      </w:r>
+      <m:oMath>
+        <m:r>
+          <m:t>h</m:t>
+        </m:r>
+      </m:oMath>
+      <w:r>
+        <w:t xml:space="preserve"> </w:t>
+      </w:r>
+      <w:r>
+        <w:t xml:space="preserve">(it did: from</w:t>
+      </w:r>
+      <w:r>
+        <w:t xml:space="preserve"> </w:t>
+      </w:r>
+      <w:r>
+        <w:t xml:space="preserve">1.59</w:t>
+      </w:r>
+      <m:oMath>
+        <m:r>
+          <m:rPr>
+            <m:sty m:val="p"/>
+          </m:rPr>
+          <m:t>×</m:t>
+        </m:r>
+      </m:oMath>
+      <w:r>
+        <w:t xml:space="preserve"> </w:t>
+      </w:r>
+      <w:r>
+        <w:t xml:space="preserve">and 2.04</w:t>
+      </w:r>
+      <m:oMath>
+        <m:r>
+          <m:rPr>
+            <m:sty m:val="p"/>
+          </m:rPr>
+          <m:t>×</m:t>
+        </m:r>
+      </m:oMath>
+      <w:r>
+        <w:t xml:space="preserve"> </w:t>
+      </w:r>
+      <w:r>
+        <w:t xml:space="preserve">at</w:t>
+      </w:r>
+      <w:r>
+        <w:t xml:space="preserve"> </w:t>
+      </w:r>
+      <m:oMath>
+        <m:r>
+          <m:t>h</m:t>
+        </m:r>
+        <m:r>
+          <m:rPr>
+            <m:sty m:val="p"/>
+          </m:rPr>
+          <m:t>=</m:t>
+        </m:r>
+        <m:r>
+          <m:t>0</m:t>
+        </m:r>
+      </m:oMath>
+      <w:r>
+        <w:t xml:space="preserve"> </w:t>
+      </w:r>
+      <w:r>
+        <w:t xml:space="preserve">to below 1.1</w:t>
+      </w:r>
+      <m:oMath>
+        <m:r>
+          <m:rPr>
+            <m:sty m:val="p"/>
+          </m:rPr>
+          <m:t>×</m:t>
+        </m:r>
+      </m:oMath>
+      <w:r>
+        <w:t xml:space="preserve"> </w:t>
+      </w:r>
+      <w:r>
+        <w:t xml:space="preserve">at</w:t>
+      </w:r>
+      <w:r>
+        <w:t xml:space="preserve"> </w:t>
+      </w:r>
+      <m:oMath>
+        <m:r>
+          <m:t>h</m:t>
+        </m:r>
+        <m:r>
+          <m:rPr>
+            <m:sty m:val="p"/>
+          </m:rPr>
+          <m:t>=</m:t>
+        </m:r>
+        <m:r>
+          <m:t>0.99</m:t>
+        </m:r>
+      </m:oMath>
+      <w:r>
+        <w:t xml:space="preserve">) and that the combination would</w:t>
+      </w:r>
+      <w:r>
+        <w:t xml:space="preserve"> </w:t>
+      </w:r>
+      <w:r>
+        <w:t xml:space="preserve">never be worse than erasure alone. The last prediction failed, and the failure is the finding: at</w:t>
+      </w:r>
+      <w:r>
+        <w:t xml:space="preserve"> </w:t>
+      </w:r>
+      <m:oMath>
+        <m:r>
+          <m:t>h</m:t>
+        </m:r>
+        <m:r>
+          <m:rPr>
+            <m:sty m:val="p"/>
+          </m:rPr>
+          <m:t>=</m:t>
+        </m:r>
+        <m:r>
+          <m:t>0.99</m:t>
+        </m:r>
+      </m:oMath>
+      <w:r>
+        <w:t xml:space="preserve"> </w:t>
+      </w:r>
+      <w:r>
+        <w:t xml:space="preserve">qg + erasure reached only 0.46</w:t>
+      </w:r>
+      <m:oMath>
+        <m:r>
+          <m:rPr>
+            <m:sty m:val="p"/>
+          </m:rPr>
+          <m:t>×</m:t>
+        </m:r>
+      </m:oMath>
+      <w:r>
+        <w:t xml:space="preserve"> </w:t>
+      </w:r>
+      <w:r>
+        <w:t xml:space="preserve">(</w:t>
+      </w:r>
+      <m:oMath>
+        <m:r>
+          <m:t>z</m:t>
+        </m:r>
+        <m:r>
+          <m:rPr>
+            <m:sty m:val="p"/>
+          </m:rPr>
+          <m:t>=</m:t>
+        </m:r>
+        <m:r>
+          <m:rPr>
+            <m:sty m:val="p"/>
+          </m:rPr>
+          <m:t>−</m:t>
+        </m:r>
+        <m:r>
+          <m:t>6.7</m:t>
+        </m:r>
+      </m:oMath>
+      <w:r>
+        <w:t xml:space="preserve">) at</w:t>
+      </w:r>
+      <w:r>
+        <w:t xml:space="preserve"> </w:t>
+      </w:r>
+      <m:oMath>
+        <m:r>
+          <m:t>d</m:t>
+        </m:r>
+        <m:r>
+          <m:rPr>
+            <m:sty m:val="p"/>
+          </m:rPr>
+          <m:t>=</m:t>
+        </m:r>
+        <m:r>
+          <m:t>3</m:t>
+        </m:r>
+      </m:oMath>
+      <w:r>
+        <w:t xml:space="preserve"> </w:t>
+      </w:r>
+      <w:r>
+        <w:t xml:space="preserve">and 0.22</w:t>
+      </w:r>
+      <m:oMath>
+        <m:r>
+          <m:rPr>
+            <m:sty m:val="p"/>
+          </m:rPr>
+          <m:t>×</m:t>
+        </m:r>
+      </m:oMath>
+      <w:r>
+        <w:t xml:space="preserve"> </w:t>
+      </w:r>
+      <w:r>
+        <w:t xml:space="preserve">at</w:t>
+      </w:r>
+      <w:r>
+        <w:t xml:space="preserve"> </w:t>
+      </w:r>
+      <m:oMath>
+        <m:r>
+          <m:t>d</m:t>
+        </m:r>
+        <m:r>
+          <m:rPr>
+            <m:sty m:val="p"/>
+          </m:rPr>
+          <m:t>=</m:t>
+        </m:r>
+        <m:r>
+          <m:t>5</m:t>
+        </m:r>
+      </m:oMath>
+      <w:r>
+        <w:t xml:space="preserve">. The</w:t>
+      </w:r>
+      <w:r>
+        <w:t xml:space="preserve"> </w:t>
+      </w:r>
+      <w:r>
+        <w:t xml:space="preserve">T1 reweighting assumes every decay is unheralded; with heralds, a 0 at the final readout is mostly</w:t>
+      </w:r>
+      <w:r>
+        <w:t xml:space="preserve"> </w:t>
+      </w:r>
+      <w:r>
+        <w:t xml:space="preserve">explained already, and the reweighting counts it twice. The witness does not catch this, because the</w:t>
+      </w:r>
+      <w:r>
+        <w:t xml:space="preserve"> </w:t>
+      </w:r>
+      <w:r>
+        <w:t xml:space="preserve">readout bias is still there at every</w:t>
+      </w:r>
+      <w:r>
+        <w:t xml:space="preserve"> </w:t>
+      </w:r>
+      <m:oMath>
+        <m:r>
+          <m:t>h</m:t>
+        </m:r>
+      </m:oMath>
+      <w:r>
+        <w:t xml:space="preserve">.</w:t>
+      </w:r>
+    </w:p>
+    <w:p>
+      <w:pPr>
+        <w:pStyle w:val="BodyText"/>
+      </w:pPr>
+      <w:r>
+        <w:t xml:space="preserve">An exploratory fix, found after that run, scales the prior of</w:t>
+      </w:r>
+      <w:r>
+        <w:t xml:space="preserve"> </w:t>
+      </w:r>
+      <w:r>
+        <w:rPr>
+          <w:iCs/>
+          <w:i/>
+        </w:rPr>
+        <w:t xml:space="preserve">unheralded</w:t>
+      </w:r>
+      <w:r>
+        <w:t xml:space="preserve"> </w:t>
+      </w:r>
+      <w:r>
+        <w:t xml:space="preserve">decays by</w:t>
+      </w:r>
+      <w:r>
+        <w:t xml:space="preserve"> </w:t>
+      </w:r>
+      <m:oMath>
+        <m:r>
+          <m:t>1</m:t>
+        </m:r>
+        <m:r>
+          <m:rPr>
+            <m:sty m:val="p"/>
+          </m:rPr>
+          <m:t>−</m:t>
+        </m:r>
+        <m:r>
+          <m:t>h</m:t>
+        </m:r>
+      </m:oMath>
+      <w:r>
+        <w:t xml:space="preserve"> </w:t>
+      </w:r>
+      <w:r>
+        <w:t xml:space="preserve">in</w:t>
+      </w:r>
+      <w:r>
+        <w:t xml:space="preserve"> </w:t>
+      </w:r>
+      <w:r>
+        <w:t xml:space="preserve">both decoders. We then tested it with a new pre-registration: new seeds, a second (mixed) regime,</w:t>
+      </w:r>
+      <w:r>
+        <w:t xml:space="preserve"> </w:t>
+      </w:r>
+      <w:r>
+        <w:t xml:space="preserve">five values of</w:t>
+      </w:r>
+      <w:r>
+        <w:t xml:space="preserve"> </w:t>
+      </w:r>
+      <m:oMath>
+        <m:r>
+          <m:t>h</m:t>
+        </m:r>
+      </m:oMath>
+      <w:r>
+        <w:t xml:space="preserve">, and</w:t>
+      </w:r>
+      <w:r>
+        <w:t xml:space="preserve"> </w:t>
+      </w:r>
+      <m:oMath>
+        <m:r>
+          <m:t>h</m:t>
+        </m:r>
+      </m:oMath>
+      <w:r>
+        <w:t xml:space="preserve"> </w:t>
+      </w:r>
+      <w:r>
+        <w:t xml:space="preserve">misestimated by about 0.1. All four predictions passed</w:t>
+      </w:r>
+      <w:r>
+        <w:t xml:space="preserve"> </w:t>
+      </w:r>
+      <w:r>
+        <w:t xml:space="preserve">(Table </w:t>
+      </w:r>
+      <w:hyperlink w:anchor="tab:erasure">
+        <w:r>
+          <w:rPr>
+            <w:rStyle w:val="Hyperlink"/>
+          </w:rPr>
+          <w:t xml:space="preserve">4</w:t>
+        </w:r>
+      </w:hyperlink>
+      <w:r>
+        <w:t xml:space="preserve">). With the rule, qg + erasure was never significantly worse than calibrated</w:t>
+      </w:r>
+      <w:r>
+        <w:t xml:space="preserve"> </w:t>
+      </w:r>
+      <w:r>
+        <w:t xml:space="preserve">erasure (closest point 0.79</w:t>
+      </w:r>
+      <m:oMath>
+        <m:r>
+          <m:rPr>
+            <m:sty m:val="p"/>
+          </m:rPr>
+          <m:t>×</m:t>
+        </m:r>
+      </m:oMath>
+      <w:r>
+        <w:t xml:space="preserve">,</w:t>
+      </w:r>
+      <w:r>
+        <w:t xml:space="preserve"> </w:t>
+      </w:r>
+      <m:oMath>
+        <m:r>
+          <m:t>z</m:t>
+        </m:r>
+        <m:r>
+          <m:rPr>
+            <m:sty m:val="p"/>
+          </m:rPr>
+          <m:t>=</m:t>
+        </m:r>
+        <m:r>
+          <m:rPr>
+            <m:sty m:val="p"/>
+          </m:rPr>
+          <m:t>−</m:t>
+        </m:r>
+        <m:r>
+          <m:t>2.0</m:t>
+        </m:r>
+      </m:oMath>
+      <w:r>
+        <w:t xml:space="preserve">, mixed regime,</w:t>
+      </w:r>
+      <w:r>
+        <w:t xml:space="preserve"> </w:t>
+      </w:r>
+      <m:oMath>
+        <m:r>
+          <m:t>d</m:t>
+        </m:r>
+        <m:r>
+          <m:rPr>
+            <m:sty m:val="p"/>
+          </m:rPr>
+          <m:t>=</m:t>
+        </m:r>
+        <m:r>
+          <m:t>5</m:t>
+        </m:r>
+      </m:oMath>
+      <w:r>
+        <w:t xml:space="preserve">,</w:t>
+      </w:r>
+      <w:r>
+        <w:t xml:space="preserve"> </w:t>
+      </w:r>
+      <m:oMath>
+        <m:r>
+          <m:t>h</m:t>
+        </m:r>
+        <m:r>
+          <m:rPr>
+            <m:sty m:val="p"/>
+          </m:rPr>
+          <m:t>=</m:t>
+        </m:r>
+        <m:r>
+          <m:t>0.9</m:t>
+        </m:r>
+      </m:oMath>
+      <w:r>
+        <w:t xml:space="preserve">); it gained 1.41</w:t>
+      </w:r>
+      <m:oMath>
+        <m:r>
+          <m:rPr>
+            <m:sty m:val="p"/>
+          </m:rPr>
+          <m:t>×</m:t>
+        </m:r>
+      </m:oMath>
+      <w:r>
+        <w:t xml:space="preserve"> </w:t>
+      </w:r>
+      <w:r>
+        <w:t xml:space="preserve">(</w:t>
+      </w:r>
+      <m:oMath>
+        <m:r>
+          <m:t>d</m:t>
+        </m:r>
+        <m:r>
+          <m:rPr>
+            <m:sty m:val="p"/>
+          </m:rPr>
+          <m:t>=</m:t>
+        </m:r>
+        <m:r>
+          <m:t>3</m:t>
+        </m:r>
+      </m:oMath>
+      <w:r>
+        <w:t xml:space="preserve">) and 1.68</w:t>
+      </w:r>
+      <m:oMath>
+        <m:r>
+          <m:rPr>
+            <m:sty m:val="p"/>
+          </m:rPr>
+          <m:t>×</m:t>
+        </m:r>
+      </m:oMath>
+      <w:r>
+        <w:t xml:space="preserve"> </w:t>
+      </w:r>
+      <w:r>
+        <w:t xml:space="preserve">(</w:t>
+      </w:r>
+      <m:oMath>
+        <m:r>
+          <m:t>d</m:t>
+        </m:r>
+        <m:r>
+          <m:rPr>
+            <m:sty m:val="p"/>
+          </m:rPr>
+          <m:t>=</m:t>
+        </m:r>
+        <m:r>
+          <m:t>5</m:t>
+        </m:r>
+      </m:oMath>
+      <w:r>
+        <w:t xml:space="preserve">) at</w:t>
+      </w:r>
+      <w:r>
+        <w:t xml:space="preserve"> </w:t>
+      </w:r>
+      <m:oMath>
+        <m:r>
+          <m:t>h</m:t>
+        </m:r>
+        <m:r>
+          <m:rPr>
+            <m:sty m:val="p"/>
+          </m:rPr>
+          <m:t>=</m:t>
+        </m:r>
+        <m:r>
+          <m:t>0.5</m:t>
+        </m:r>
+      </m:oMath>
+      <w:r>
+        <w:t xml:space="preserve"> </w:t>
+      </w:r>
+      <w:r>
+        <w:t xml:space="preserve">and faded to about 1 at</w:t>
+      </w:r>
+      <w:r>
+        <w:t xml:space="preserve"> </w:t>
+      </w:r>
+      <m:oMath>
+        <m:r>
+          <m:t>h</m:t>
+        </m:r>
+        <m:r>
+          <m:rPr>
+            <m:sty m:val="p"/>
+          </m:rPr>
+          <m:t>=</m:t>
+        </m:r>
+        <m:r>
+          <m:t>0.99</m:t>
+        </m:r>
+      </m:oMath>
+      <w:r>
+        <w:t xml:space="preserve">; calibration also improved</w:t>
+      </w:r>
+      <w:r>
+        <w:t xml:space="preserve"> </w:t>
+      </w:r>
+      <w:r>
+        <w:t xml:space="preserve">erasure alone at high</w:t>
+      </w:r>
+      <w:r>
+        <w:t xml:space="preserve"> </w:t>
+      </w:r>
+      <m:oMath>
+        <m:r>
+          <m:t>h</m:t>
+        </m:r>
+      </m:oMath>
+      <w:r>
+        <w:t xml:space="preserve">; and an error of 0.1 in</w:t>
+      </w:r>
+      <w:r>
+        <w:t xml:space="preserve"> </w:t>
+      </w:r>
+      <m:oMath>
+        <m:r>
+          <m:t>h</m:t>
+        </m:r>
+      </m:oMath>
+      <w:r>
+        <w:t xml:space="preserve"> </w:t>
+      </w:r>
+      <w:r>
+        <w:t xml:space="preserve">changed little.</w:t>
+      </w:r>
+    </w:p>
+    <w:bookmarkStart w:id="32" w:name="tab:erasure"/>
+    <w:p>
+      <w:pPr>
+        <w:pStyle w:val="TableCaption"/>
+      </w:pPr>
+      <w:r>
+        <w:rPr>
+          <w:b/>
+          <w:i w:val="0"/>
+        </w:rPr>
+        <w:t xml:space="preserve">Table 4: </w:t>
+      </w:r>
+      <w:r>
+        <w:t xml:space="preserve">Gain of qg + erasure over erasure, both with unheralded decay priors scaled by</w:t>
+      </w:r>
+      <w:r>
+        <w:t xml:space="preserve"> </w:t>
+      </w:r>
+      <m:oMath>
+        <m:r>
+          <m:t>1</m:t>
+        </m:r>
+        <m:r>
+          <m:rPr>
+            <m:sty m:val="p"/>
+          </m:rPr>
+          <m:t>−</m:t>
+        </m:r>
+        <m:r>
+          <m:t>h</m:t>
+        </m:r>
+      </m:oMath>
+      <w:r>
+        <w:t xml:space="preserve"> </w:t>
+      </w:r>
+      <w:r>
+        <w:t xml:space="preserve">(paired</w:t>
+      </w:r>
+      <w:r>
+        <w:t xml:space="preserve"> </w:t>
+      </w:r>
+      <m:oMath>
+        <m:r>
+          <m:t>z</m:t>
+        </m:r>
+      </m:oMath>
+      <w:r>
+        <w:t xml:space="preserve"> </w:t>
+      </w:r>
+      <w:r>
+        <w:t xml:space="preserve">in brackets), 60 000 shots per point.</w:t>
+      </w:r>
+    </w:p>
+    <w:tbl>
+      <w:tblPr>
+        <w:tblStyle w:val="Table"/>
+        <w:tblLook w:firstRow="1" w:lastRow="0" w:firstColumn="0" w:lastColumn="0" w:noHBand="0" w:noVBand="0" w:val="0020"/>
+        <w:jc w:val="start"/>
+        <w:tblCaption w:val="Gain of qg + erasure over erasure, both with unheralded decay priors scaled by 1-h (paired z in brackets), 60 000 shots per point."/>
+        <w:tblW w:w="5000" w:type="pct"/>
+        <w:tblLayout w:type="autofit"/>
+      </w:tblPr>
+      <w:tblGrid>
+        <w:gridCol/>
+        <w:gridCol/>
+        <w:gridCol/>
+        <w:gridCol/>
+        <w:gridCol/>
+        <w:gridCol/>
+        <w:gridCol/>
+      </w:tblGrid>
+      <w:tr>
+        <w:trPr>
+          <w:tblHeader w:val="true"/>
+        </w:trPr>
+        <w:tc>
+          <w:tcPr/>
+          <w:p>
+            <w:pPr>
+              <w:pStyle w:val="Compact"/>
+              <w:jc w:val="left"/>
+            </w:pPr>
+            <w:r>
+              <w:rPr>
+                <w:sz w:val="18"/>
+              </w:rPr>
+              <w:t xml:space="preserve">regime</w:t>
+            </w:r>
+          </w:p>
+        </w:tc>
+        <w:tc>
+          <w:tcPr/>
+          <w:p>
+            <w:pPr>
+              <w:pStyle w:val="Compact"/>
+              <w:jc w:val="center"/>
+            </w:pPr>
+            <m:oMath>
+              <m:r>
+                <m:t>d</m:t>
+              </m:r>
+            </m:oMath>
+          </w:p>
+        </w:tc>
+        <w:tc>
+          <w:tcPr/>
+          <w:p>
+            <w:pPr>
+              <w:pStyle w:val="Compact"/>
+              <w:jc w:val="center"/>
+            </w:pPr>
+            <m:oMath>
+              <m:r>
+                <m:t>h</m:t>
+              </m:r>
+              <m:r>
+                <m:rPr>
+                  <m:sty m:val="p"/>
+                </m:rPr>
+                <m:t>=</m:t>
+              </m:r>
+              <m:r>
+                <m:t>0.25</m:t>
+              </m:r>
+            </m:oMath>
+          </w:p>
+        </w:tc>
+        <w:tc>
+          <w:tcPr/>
+          <w:p>
+            <w:pPr>
+              <w:pStyle w:val="Compact"/>
+              <w:jc w:val="center"/>
+            </w:pPr>
+            <w:r>
+              <w:rPr>
+                <w:sz w:val="18"/>
+              </w:rPr>
+              <w:t xml:space="preserve">0.5</w:t>
+            </w:r>
+          </w:p>
+        </w:tc>
+        <w:tc>
+          <w:tcPr/>
+          <w:p>
+            <w:pPr>
+              <w:pStyle w:val="Compact"/>
+              <w:jc w:val="center"/>
+            </w:pPr>
+            <w:r>
+              <w:rPr>
+                <w:sz w:val="18"/>
+              </w:rPr>
+              <w:t xml:space="preserve">0.75</w:t>
+            </w:r>
+          </w:p>
+        </w:tc>
+        <w:tc>
+          <w:tcPr/>
+          <w:p>
+            <w:pPr>
+              <w:pStyle w:val="Compact"/>
+              <w:jc w:val="center"/>
+            </w:pPr>
+            <w:r>
+              <w:rPr>
+                <w:sz w:val="18"/>
+              </w:rPr>
+              <w:t xml:space="preserve">0.9</w:t>
+            </w:r>
+          </w:p>
+        </w:tc>
+        <w:tc>
+          <w:tcPr/>
+          <w:p>
+            <w:pPr>
+              <w:pStyle w:val="Compact"/>
+              <w:jc w:val="center"/>
+            </w:pPr>
+            <w:r>
+              <w:rPr>
+                <w:sz w:val="18"/>
+              </w:rPr>
+              <w:t xml:space="preserve">0.99</w:t>
+            </w:r>
+          </w:p>
+        </w:tc>
+      </w:tr>
+      <w:tr>
+        <w:tc>
+          <w:tcPr/>
+          <w:p>
+            <w:pPr>
+              <w:pStyle w:val="Compact"/>
+              <w:jc w:val="left"/>
+            </w:pPr>
+            <w:r>
+              <w:rPr>
+                <w:sz w:val="18"/>
+              </w:rPr>
+              <w:t xml:space="preserve">T1-dominated</w:t>
+            </w:r>
+          </w:p>
+        </w:tc>
+        <w:tc>
+          <w:tcPr/>
+          <w:p>
+            <w:pPr>
+              <w:pStyle w:val="Compact"/>
+              <w:jc w:val="center"/>
+            </w:pPr>
+            <w:r>
+              <w:rPr>
+                <w:sz w:val="18"/>
+              </w:rPr>
+              <w:t xml:space="preserve">3</w:t>
+            </w:r>
+          </w:p>
+        </w:tc>
+        <w:tc>
+          <w:tcPr/>
+          <w:p>
+            <w:pPr>
+              <w:pStyle w:val="Compact"/>
+              <w:jc w:val="center"/>
+            </w:pPr>
+            <w:r>
+              <w:rPr>
+                <w:sz w:val="18"/>
+              </w:rPr>
+              <w:t xml:space="preserve">1.50 (+11.1)</w:t>
+            </w:r>
+          </w:p>
+        </w:tc>
+        <w:tc>
+          <w:tcPr/>
+          <w:p>
+            <w:pPr>
+              <w:pStyle w:val="Compact"/>
+              <w:jc w:val="center"/>
+            </w:pPr>
+            <w:r>
+              <w:rPr>
+                <w:sz w:val="18"/>
+              </w:rPr>
+              <w:t xml:space="preserve">1.41 (+9.0)</w:t>
+            </w:r>
+          </w:p>
+        </w:tc>
+        <w:tc>
+          <w:tcPr/>
+          <w:p>
+            <w:pPr>
+              <w:pStyle w:val="Compact"/>
+              <w:jc w:val="center"/>
+            </w:pPr>
+            <w:r>
+              <w:rPr>
+                <w:sz w:val="18"/>
+              </w:rPr>
+              <w:t xml:space="preserve">1.25 (+4.2)</w:t>
+            </w:r>
+          </w:p>
+        </w:tc>
+        <w:tc>
+          <w:tcPr/>
+          <w:p>
+            <w:pPr>
+              <w:pStyle w:val="Compact"/>
+              <w:jc w:val="center"/>
+            </w:pPr>
+            <w:r>
+              <w:rPr>
+                <w:sz w:val="18"/>
+              </w:rPr>
+              <w:t xml:space="preserve">1.09 (+1.2)</w:t>
+            </w:r>
+          </w:p>
+        </w:tc>
+        <w:tc>
+          <w:tcPr/>
+          <w:p>
+            <w:pPr>
+              <w:pStyle w:val="Compact"/>
+              <w:jc w:val="center"/>
+            </w:pPr>
+            <w:r>
+              <w:rPr>
+                <w:sz w:val="18"/>
+              </w:rPr>
+              <w:t xml:space="preserve">0.92 (</w:t>
+            </w:r>
+            <m:oMath>
+              <m:r>
+                <m:rPr>
+                  <m:sty m:val="p"/>
+                </m:rPr>
+                <m:t>−</m:t>
+              </m:r>
+              <m:r>
+                <m:t>0.8</m:t>
+              </m:r>
+            </m:oMath>
+            <w:r>
+              <w:rPr>
+                <w:sz w:val="18"/>
+              </w:rPr>
+              <w:t xml:space="preserve">)</w:t>
+            </w:r>
+          </w:p>
+        </w:tc>
+      </w:tr>
+      <w:tr>
+        <w:tc>
+          <w:tcPr/>
+          <w:p>
+            <w:pPr>
+              <w:pStyle w:val="Compact"/>
+              <w:jc w:val="left"/>
+            </w:pPr>
+            <w:r>
+              <w:rPr>
+                <w:sz w:val="18"/>
+              </w:rPr>
+              <w:t xml:space="preserve">T1-dominated</w:t>
+            </w:r>
+          </w:p>
+        </w:tc>
+        <w:tc>
+          <w:tcPr/>
+          <w:p>
+            <w:pPr>
+              <w:pStyle w:val="Compact"/>
+              <w:jc w:val="center"/>
+            </w:pPr>
+            <w:r>
+              <w:rPr>
+                <w:sz w:val="18"/>
+              </w:rPr>
+              <w:t xml:space="preserve">5</w:t>
+            </w:r>
+          </w:p>
+        </w:tc>
+        <w:tc>
+          <w:tcPr/>
+          <w:p>
+            <w:pPr>
+              <w:pStyle w:val="Compact"/>
+              <w:jc w:val="center"/>
+            </w:pPr>
+            <w:r>
+              <w:rPr>
+                <w:sz w:val="18"/>
+              </w:rPr>
+              <w:t xml:space="preserve">1.93 (+9.0)</w:t>
+            </w:r>
+          </w:p>
+        </w:tc>
+        <w:tc>
+          <w:tcPr/>
+          <w:p>
+            <w:pPr>
+              <w:pStyle w:val="Compact"/>
+              <w:jc w:val="center"/>
+            </w:pPr>
+            <w:r>
+              <w:rPr>
+                <w:sz w:val="18"/>
+              </w:rPr>
+              <w:t xml:space="preserve">1.68 (+5.4)</w:t>
+            </w:r>
+          </w:p>
+        </w:tc>
+        <w:tc>
+          <w:tcPr/>
+          <w:p>
+            <w:pPr>
+              <w:pStyle w:val="Compact"/>
+              <w:jc w:val="center"/>
+            </w:pPr>
+            <w:r>
+              <w:rPr>
+                <w:sz w:val="18"/>
+              </w:rPr>
+              <w:t xml:space="preserve">1.39 (+2.8)</w:t>
+            </w:r>
+          </w:p>
+        </w:tc>
+        <w:tc>
+          <w:tcPr/>
+          <w:p>
+            <w:pPr>
+              <w:pStyle w:val="Compact"/>
+              <w:jc w:val="center"/>
+            </w:pPr>
+            <w:r>
+              <w:rPr>
+                <w:sz w:val="18"/>
+              </w:rPr>
+              <w:t xml:space="preserve">1.45 (+2.2)</w:t>
+            </w:r>
+          </w:p>
+        </w:tc>
+        <w:tc>
+          <w:tcPr/>
+          <w:p>
+            <w:pPr>
+              <w:pStyle w:val="Compact"/>
+              <w:jc w:val="center"/>
+            </w:pPr>
+            <w:r>
+              <w:rPr>
+                <w:sz w:val="18"/>
+              </w:rPr>
+              <w:t xml:space="preserve">1.00 (0.0)</w:t>
+            </w:r>
+          </w:p>
+        </w:tc>
+      </w:tr>
+      <w:tr>
+        <w:tc>
+          <w:tcPr/>
+          <w:p>
+            <w:pPr>
+              <w:pStyle w:val="Compact"/>
+              <w:jc w:val="left"/>
+            </w:pPr>
+            <w:r>
+              <w:rPr>
+                <w:sz w:val="18"/>
+              </w:rPr>
+              <w:t xml:space="preserve">mixed</w:t>
+            </w:r>
+          </w:p>
+        </w:tc>
+        <w:tc>
+          <w:tcPr/>
+          <w:p>
+            <w:pPr>
+              <w:pStyle w:val="Compact"/>
+              <w:jc w:val="center"/>
+            </w:pPr>
+            <w:r>
+              <w:rPr>
+                <w:sz w:val="18"/>
+              </w:rPr>
+              <w:t xml:space="preserve">3</w:t>
+            </w:r>
+          </w:p>
+        </w:tc>
+        <w:tc>
+          <w:tcPr/>
+          <w:p>
+            <w:pPr>
+              <w:pStyle w:val="Compact"/>
+              <w:jc w:val="center"/>
+            </w:pPr>
+            <w:r>
+              <w:rPr>
+                <w:sz w:val="18"/>
+              </w:rPr>
+              <w:t xml:space="preserve">1.19 (+4.9)</w:t>
+            </w:r>
+          </w:p>
+        </w:tc>
+        <w:tc>
+          <w:tcPr/>
+          <w:p>
+            <w:pPr>
+              <w:pStyle w:val="Compact"/>
+              <w:jc w:val="center"/>
+            </w:pPr>
+            <w:r>
+              <w:rPr>
+                <w:sz w:val="18"/>
+              </w:rPr>
+              <w:t xml:space="preserve">1.18 (+4.1)</w:t>
+            </w:r>
+          </w:p>
+        </w:tc>
+        <w:tc>
+          <w:tcPr/>
+          <w:p>
+            <w:pPr>
+              <w:pStyle w:val="Compact"/>
+              <w:jc w:val="center"/>
+            </w:pPr>
+            <w:r>
+              <w:rPr>
+                <w:sz w:val="18"/>
+              </w:rPr>
+              <w:t xml:space="preserve">1.16 (+2.6)</w:t>
+            </w:r>
+          </w:p>
+        </w:tc>
+        <w:tc>
+          <w:tcPr/>
+          <w:p>
+            <w:pPr>
+              <w:pStyle w:val="Compact"/>
+              <w:jc w:val="center"/>
+            </w:pPr>
+            <w:r>
+              <w:rPr>
+                <w:sz w:val="18"/>
+              </w:rPr>
+              <w:t xml:space="preserve">1.07 (+1.2)</w:t>
+            </w:r>
+          </w:p>
+        </w:tc>
+        <w:tc>
+          <w:tcPr/>
+          <w:p>
+            <w:pPr>
+              <w:pStyle w:val="Compact"/>
+              <w:jc w:val="center"/>
+            </w:pPr>
+            <w:r>
+              <w:rPr>
+                <w:sz w:val="18"/>
+              </w:rPr>
+              <w:t xml:space="preserve">1.12 (+1.8)</w:t>
+            </w:r>
+          </w:p>
+        </w:tc>
+      </w:tr>
+      <w:tr>
+        <w:tc>
+          <w:tcPr/>
+          <w:p>
+            <w:pPr>
+              <w:pStyle w:val="Compact"/>
+              <w:jc w:val="left"/>
+            </w:pPr>
+            <w:r>
+              <w:rPr>
+                <w:sz w:val="18"/>
+              </w:rPr>
+              <w:t xml:space="preserve">mixed</w:t>
+            </w:r>
+          </w:p>
+        </w:tc>
+        <w:tc>
+          <w:tcPr/>
+          <w:p>
+            <w:pPr>
+              <w:pStyle w:val="Compact"/>
+              <w:jc w:val="center"/>
+            </w:pPr>
+            <w:r>
+              <w:rPr>
+                <w:sz w:val="18"/>
+              </w:rPr>
+              <w:t xml:space="preserve">5</w:t>
+            </w:r>
+          </w:p>
+        </w:tc>
+        <w:tc>
+          <w:tcPr/>
+          <w:p>
+            <w:pPr>
+              <w:pStyle w:val="Compact"/>
+              <w:jc w:val="center"/>
+            </w:pPr>
+            <w:r>
+              <w:rPr>
+                <w:sz w:val="18"/>
+              </w:rPr>
+              <w:t xml:space="preserve">1.47 (+5.2)</w:t>
+            </w:r>
+          </w:p>
+        </w:tc>
+        <w:tc>
+          <w:tcPr/>
+          <w:p>
+            <w:pPr>
+              <w:pStyle w:val="Compact"/>
+              <w:jc w:val="center"/>
+            </w:pPr>
+            <w:r>
+              <w:rPr>
+                <w:sz w:val="18"/>
+              </w:rPr>
+              <w:t xml:space="preserve">1.30 (+2.7)</w:t>
+            </w:r>
+          </w:p>
+        </w:tc>
+        <w:tc>
+          <w:tcPr/>
+          <w:p>
+            <w:pPr>
+              <w:pStyle w:val="Compact"/>
+              <w:jc w:val="center"/>
+            </w:pPr>
+            <w:r>
+              <w:rPr>
+                <w:sz w:val="18"/>
+              </w:rPr>
+              <w:t xml:space="preserve">1.03 (+0.3)</w:t>
+            </w:r>
+          </w:p>
+        </w:tc>
+        <w:tc>
+          <w:tcPr/>
+          <w:p>
+            <w:pPr>
+              <w:pStyle w:val="Compact"/>
+              <w:jc w:val="center"/>
+            </w:pPr>
+            <w:r>
+              <w:rPr>
+                <w:sz w:val="18"/>
+              </w:rPr>
+              <w:t xml:space="preserve">0.79 (</w:t>
+            </w:r>
+            <m:oMath>
+              <m:r>
+                <m:rPr>
+                  <m:sty m:val="p"/>
+                </m:rPr>
+                <m:t>−</m:t>
+              </m:r>
+              <m:r>
+                <m:t>2.0</m:t>
+              </m:r>
+            </m:oMath>
+            <w:r>
+              <w:rPr>
+                <w:sz w:val="18"/>
+              </w:rPr>
+              <w:t xml:space="preserve">)</w:t>
+            </w:r>
+          </w:p>
+        </w:tc>
+        <w:tc>
+          <w:tcPr/>
+          <w:p>
+            <w:pPr>
+              <w:pStyle w:val="Compact"/>
+              <w:jc w:val="center"/>
+            </w:pPr>
+            <w:r>
+              <w:rPr>
+                <w:sz w:val="18"/>
+              </w:rPr>
+              <w:t xml:space="preserve">1.00 (0.0)</w:t>
+            </w:r>
+          </w:p>
+        </w:tc>
+      </w:tr>
+    </w:tbl>
+    <w:bookmarkEnd w:id="32"/>
+    <w:bookmarkEnd w:id="33"/>
+    <w:bookmarkEnd w:id="34"/>
+    <w:bookmarkStart w:id="35" w:name="what-decides-it"/>
+    <w:p>
+      <w:pPr>
+        <w:pStyle w:val="Heading1"/>
+      </w:pPr>
+      <w:r>
+        <w:t xml:space="preserve">What decides it</w:t>
+      </w:r>
+    </w:p>
+    <w:p>
+      <w:pPr>
+        <w:pStyle w:val="FirstParagraph"/>
+      </w:pPr>
+      <w:r>
+        <w:t xml:space="preserve">The six tests fit one picture. Whether a three-level readout helps is decided by two properties of</w:t>
       </w:r>
       <w:r>
         <w:t xml:space="preserve"> </w:t>
@@ -8249,11 +10018,66 @@
         <w:t xml:space="preserve"> </w:t>
       </w:r>
       <w:r>
-        <w:t xml:space="preserve">three-level readout enters, where it helps, as an input to the qg decoder, not as a new qg.</w:t>
+        <w:t xml:space="preserve">three-level readout enters, where it helps, as an input to the qg decoder, not as a new qg. Heralded</w:t>
+      </w:r>
+      <w:r>
+        <w:t xml:space="preserve"> </w:t>
+      </w:r>
+      <w:r>
+        <w:t xml:space="preserve">erasures are the limit where the extra information is complete: there the qg reweighting must be told</w:t>
+      </w:r>
+      <w:r>
+        <w:t xml:space="preserve"> </w:t>
+      </w:r>
+      <w:r>
+        <w:t xml:space="preserve">how much has already been heralded, through the</w:t>
+      </w:r>
+      <w:r>
+        <w:t xml:space="preserve"> </w:t>
+      </w:r>
+      <m:oMath>
+        <m:r>
+          <m:t>1</m:t>
+        </m:r>
+        <m:r>
+          <m:rPr>
+            <m:sty m:val="p"/>
+          </m:rPr>
+          <m:t>−</m:t>
+        </m:r>
+        <m:r>
+          <m:t>h</m:t>
+        </m:r>
+      </m:oMath>
+      <w:r>
+        <w:t xml:space="preserve"> </w:t>
+      </w:r>
+      <w:r>
+        <w:t xml:space="preserve">scaling, and it fades as</w:t>
+      </w:r>
+      <w:r>
+        <w:t xml:space="preserve"> </w:t>
+      </w:r>
+      <m:oMath>
+        <m:r>
+          <m:t>h</m:t>
+        </m:r>
+        <m:r>
+          <m:rPr>
+            <m:sty m:val="p"/>
+          </m:rPr>
+          <m:t>→</m:t>
+        </m:r>
+        <m:r>
+          <m:t>1</m:t>
+        </m:r>
+      </m:oMath>
+      <w:r>
+        <w:t xml:space="preserve">.</w:t>
       </w:r>
     </w:p>
-    <w:bookmarkEnd w:id="33"/>
-    <w:bookmarkStart w:id="34" w:name="limitations"/>
+    <w:bookmarkEnd w:id="35"/>
+    <w:bookmarkStart w:id="36" w:name="limitations"/>
     <w:p>
       <w:pPr>
         <w:pStyle w:val="Heading1"/>
@@ -8357,7 +10181,27 @@
         <w:t xml:space="preserve"> </w:t>
       </w:r>
       <w:r>
-        <w:t xml:space="preserve">uniform prior on the pre-leak value; one prediction about it failed. (v) Erasure decoding of leakage</w:t>
+        <w:t xml:space="preserve">uniform prior on the pre-leak value; one prediction about it failed. (v) The erasure model heralds</w:t>
+      </w:r>
+      <w:r>
+        <w:t xml:space="preserve"> </w:t>
+      </w:r>
+      <w:r>
+        <w:t xml:space="preserve">data-qubit decays only, at their exact location, with</w:t>
+      </w:r>
+      <w:r>
+        <w:t xml:space="preserve"> </w:t>
+      </w:r>
+      <m:oMath>
+        <m:r>
+          <m:t>h</m:t>
+        </m:r>
+      </m:oMath>
+      <w:r>
+        <w:t xml:space="preserve"> </w:t>
+      </w:r>
+      <w:r>
+        <w:t xml:space="preserve">known to about 0.1. (vi) Erasure decoding of leakage</w:t>
       </w:r>
       <w:r>
         <w:t xml:space="preserve"> </w:t>
@@ -8387,11 +10231,34 @@
         <w:t xml:space="preserve"> </w:t>
       </w:r>
       <w:r>
-        <w:t xml:space="preserve">transmon on this map.</w:t>
+        <w:t xml:space="preserve">transmon on this map, and the</w:t>
+      </w:r>
+      <w:r>
+        <w:t xml:space="preserve"> </w:t>
+      </w:r>
+      <m:oMath>
+        <m:r>
+          <m:t>1</m:t>
+        </m:r>
+        <m:r>
+          <m:rPr>
+            <m:sty m:val="p"/>
+          </m:rPr>
+          <m:t>−</m:t>
+        </m:r>
+        <m:r>
+          <m:t>h</m:t>
+        </m:r>
+      </m:oMath>
+      <w:r>
+        <w:t xml:space="preserve"> </w:t>
+      </w:r>
+      <w:r>
+        <w:t xml:space="preserve">rule for combining qg with heralded erasures.</w:t>
       </w:r>
     </w:p>
-    <w:bookmarkEnd w:id="34"/>
-    <w:bookmarkStart w:id="36" w:name="code-availability"/>
+    <w:bookmarkEnd w:id="36"/>
+    <w:bookmarkStart w:id="38" w:name="code-availability"/>
     <w:p>
       <w:pPr>
         <w:pStyle w:val="Heading1"/>
@@ -8435,10 +10302,7 @@
         <w:t xml:space="preserve">examples/qutrit_bayes_weight_qg.py</w:t>
       </w:r>
       <w:r>
-        <w:t xml:space="preserve"> </w:t>
-      </w:r>
-      <w:r>
-        <w:t xml:space="preserve">and</w:t>
+        <w:t xml:space="preserve">,</w:t>
       </w:r>
       <w:r>
         <w:t xml:space="preserve"> </w:t>
@@ -8450,6 +10314,33 @@
         <w:t xml:space="preserve">examples/transmon_leakage_channel_qg.py</w:t>
       </w:r>
       <w:r>
+        <w:t xml:space="preserve">,</w:t>
+      </w:r>
+      <w:r>
+        <w:t xml:space="preserve"> </w:t>
+      </w:r>
+      <w:r>
+        <w:rPr>
+          <w:rStyle w:val="VerbatimChar"/>
+        </w:rPr>
+        <w:t xml:space="preserve">examples/erasure_qubits_qg.py</w:t>
+      </w:r>
+      <w:r>
+        <w:t xml:space="preserve"> </w:t>
+      </w:r>
+      <w:r>
+        <w:t xml:space="preserve">and</w:t>
+      </w:r>
+      <w:r>
+        <w:t xml:space="preserve"> </w:t>
+      </w:r>
+      <w:r>
+        <w:rPr>
+          <w:rStyle w:val="VerbatimChar"/>
+        </w:rPr>
+        <w:t xml:space="preserve">examples/erasure_calibrated_qg.py</w:t>
+      </w:r>
+      <w:r>
         <w:t xml:space="preserve"> </w:t>
       </w:r>
       <w:r>
@@ -8458,7 +10349,7 @@
       <w:r>
         <w:t xml:space="preserve"> </w:t>
       </w:r>
-      <w:hyperlink r:id="rId35">
+      <w:hyperlink r:id="rId37">
         <w:r>
           <w:rPr>
             <w:rStyle w:val="Hyperlink"/>
@@ -8470,13 +10361,7 @@
         <w:t xml:space="preserve"> </w:t>
       </w:r>
       <w:r>
-        <w:t xml:space="preserve">(MIT license), with regression tests. Sections 70, 70b, 71 and</w:t>
-      </w:r>
-      <w:r>
-        <w:t xml:space="preserve"> </w:t>
-      </w:r>
-      <w:r>
-        <w:t xml:space="preserve">72 of</w:t>
+        <w:t xml:space="preserve">(MIT license), with regression tests. Sections 70–74 of</w:t>
       </w:r>
       <w:r>
         <w:t xml:space="preserve"> </w:t>
@@ -8494,8 +10379,8 @@
         <w:t xml:space="preserve">give more detail.</w:t>
       </w:r>
     </w:p>
-    <w:bookmarkEnd w:id="36"/>
-    <w:bookmarkStart w:id="53" w:name="acknowledgments-and-use-of-ai-tools"/>
+    <w:bookmarkEnd w:id="38"/>
+    <w:bookmarkStart w:id="57" w:name="acknowledgments-and-use-of-ai-tools"/>
     <w:p>
       <w:pPr>
         <w:pStyle w:val="Heading1"/>
@@ -8524,8 +10409,8 @@
         <w:t xml:space="preserve">AI-assisted output, including every number reported here.</w:t>
       </w:r>
     </w:p>
-    <w:bookmarkStart w:id="52" w:name="refs"/>
-    <w:bookmarkStart w:id="38" w:name="ref-monteverde2026qang"/>
+    <w:bookmarkStart w:id="56" w:name="refs"/>
+    <w:bookmarkStart w:id="40" w:name="ref-monteverde2026qang"/>
     <w:p>
       <w:pPr>
         <w:pStyle w:val="Heading1"/>
@@ -8577,7 +10462,7 @@
       <w:r>
         <w:t xml:space="preserve"> </w:t>
       </w:r>
-      <w:hyperlink r:id="rId37">
+      <w:hyperlink r:id="rId39">
         <w:r>
           <w:rPr>
             <w:rStyle w:val="Hyperlink"/>
@@ -8589,8 +10474,8 @@
         <w:t xml:space="preserve">.</w:t>
       </w:r>
     </w:p>
-    <w:bookmarkEnd w:id="38"/>
-    <w:bookmarkStart w:id="39" w:name="ref-monteverde2026witness"/>
+    <w:bookmarkEnd w:id="40"/>
+    <w:bookmarkStart w:id="41" w:name="ref-monteverde2026witness"/>
     <w:p>
       <w:pPr>
         <w:pStyle w:val="Bibliography"/>
@@ -8620,8 +10505,8 @@
         <w:t xml:space="preserve">2026.</w:t>
       </w:r>
     </w:p>
-    <w:bookmarkEnd w:id="39"/>
-    <w:bookmarkStart w:id="40" w:name="ref-aliferis2007leakage"/>
+    <w:bookmarkEnd w:id="41"/>
+    <w:bookmarkStart w:id="42" w:name="ref-aliferis2007leakage"/>
     <w:p>
       <w:pPr>
         <w:pStyle w:val="Bibliography"/>
@@ -8658,8 +10543,8 @@
         <w:t xml:space="preserve">, vol. 7, pp. 139–156, 2007.</w:t>
       </w:r>
     </w:p>
-    <w:bookmarkEnd w:id="40"/>
-    <w:bookmarkStart w:id="41" w:name="ref-suchara2015leakage"/>
+    <w:bookmarkEnd w:id="42"/>
+    <w:bookmarkStart w:id="43" w:name="ref-suchara2015leakage"/>
     <w:p>
       <w:pPr>
         <w:pStyle w:val="Bibliography"/>
@@ -8696,8 +10581,8 @@
         <w:t xml:space="preserve">, vol. 15, pp. 997–1016, 2015.</w:t>
       </w:r>
     </w:p>
-    <w:bookmarkEnd w:id="41"/>
-    <w:bookmarkStart w:id="43" w:name="ref-mcewen2021leakage"/>
+    <w:bookmarkEnd w:id="43"/>
+    <w:bookmarkStart w:id="45" w:name="ref-mcewen2021leakage"/>
     <w:p>
       <w:pPr>
         <w:pStyle w:val="Bibliography"/>
@@ -8749,7 +10634,7 @@
       <w:r>
         <w:t xml:space="preserve"> </w:t>
       </w:r>
-      <w:hyperlink r:id="rId42">
+      <w:hyperlink r:id="rId44">
         <w:r>
           <w:rPr>
             <w:rStyle w:val="Hyperlink"/>
@@ -8761,8 +10646,8 @@
         <w:t xml:space="preserve">.</w:t>
       </w:r>
     </w:p>
-    <w:bookmarkEnd w:id="43"/>
-    <w:bookmarkStart w:id="45" w:name="ref-wu2022erasure"/>
+    <w:bookmarkEnd w:id="45"/>
+    <w:bookmarkStart w:id="47" w:name="ref-wu2022erasure"/>
     <w:p>
       <w:pPr>
         <w:pStyle w:val="Bibliography"/>
@@ -8813,7 +10698,7 @@
       <w:r>
         <w:t xml:space="preserve"> </w:t>
       </w:r>
-      <w:hyperlink r:id="rId44">
+      <w:hyperlink r:id="rId46">
         <w:r>
           <w:rPr>
             <w:rStyle w:val="Hyperlink"/>
@@ -8825,8 +10710,8 @@
         <w:t xml:space="preserve">.</w:t>
       </w:r>
     </w:p>
-    <w:bookmarkEnd w:id="45"/>
-    <w:bookmarkStart w:id="47" w:name="ref-varbanov2020leakage"/>
+    <w:bookmarkEnd w:id="47"/>
+    <w:bookmarkStart w:id="49" w:name="ref-varbanov2020leakage"/>
     <w:p>
       <w:pPr>
         <w:pStyle w:val="Bibliography"/>
@@ -8878,7 +10763,7 @@
       <w:r>
         <w:t xml:space="preserve"> </w:t>
       </w:r>
-      <w:hyperlink r:id="rId46">
+      <w:hyperlink r:id="rId48">
         <w:r>
           <w:rPr>
             <w:rStyle w:val="Hyperlink"/>
@@ -8890,8 +10775,8 @@
         <w:t xml:space="preserve">.</w:t>
       </w:r>
     </w:p>
-    <w:bookmarkEnd w:id="47"/>
-    <w:bookmarkStart w:id="49" w:name="ref-higgott2022pymatching"/>
+    <w:bookmarkEnd w:id="49"/>
+    <w:bookmarkStart w:id="51" w:name="ref-higgott2022pymatching"/>
     <w:p>
       <w:pPr>
         <w:pStyle w:val="Bibliography"/>
@@ -8948,7 +10833,7 @@
       <w:r>
         <w:t xml:space="preserve"> </w:t>
       </w:r>
-      <w:hyperlink r:id="rId48">
+      <w:hyperlink r:id="rId50">
         <w:r>
           <w:rPr>
             <w:rStyle w:val="Hyperlink"/>
@@ -8960,8 +10845,8 @@
         <w:t xml:space="preserve">.</w:t>
       </w:r>
     </w:p>
-    <w:bookmarkEnd w:id="49"/>
-    <w:bookmarkStart w:id="51" w:name="ref-dicarlo2009"/>
+    <w:bookmarkEnd w:id="51"/>
+    <w:bookmarkStart w:id="53" w:name="ref-dicarlo2009"/>
     <w:p>
       <w:pPr>
         <w:pStyle w:val="Bibliography"/>
@@ -9013,7 +10898,7 @@
       <w:r>
         <w:t xml:space="preserve"> </w:t>
       </w:r>
-      <w:hyperlink r:id="rId50">
+      <w:hyperlink r:id="rId52">
         <w:r>
           <w:rPr>
             <w:rStyle w:val="Hyperlink"/>
@@ -9025,9 +10910,97 @@
         <w:t xml:space="preserve">.</w:t>
       </w:r>
     </w:p>
-    <w:bookmarkEnd w:id="51"/>
-    <w:bookmarkEnd w:id="52"/>
     <w:bookmarkEnd w:id="53"/>
+    <w:bookmarkStart w:id="55" w:name="ref-kubica2023erasure"/>
+    <w:p>
+      <w:pPr>
+        <w:pStyle w:val="Bibliography"/>
+      </w:pPr>
+      <w:r>
+        <w:t xml:space="preserve">[10]</w:t>
+      </w:r>
+      <w:r>
+        <w:t xml:space="preserve"> </w:t>
+      </w:r>
+      <w:r>
+        <w:t xml:space="preserve">	</w:t>
+      </w:r>
+      <w:r>
+        <w:t xml:space="preserve">A. Kubica</w:t>
+      </w:r>
+      <w:r>
+        <w:t xml:space="preserve"> </w:t>
+      </w:r>
+      <w:r>
+        <w:rPr>
+          <w:iCs/>
+          <w:i/>
+        </w:rPr>
+        <w:t xml:space="preserve">et al.</w:t>
+      </w:r>
+      <w:r>
+        <w:t xml:space="preserve">,</w:t>
+      </w:r>
+      <w:r>
+        <w:t xml:space="preserve"> </w:t>
+      </w:r>
+      <w:r>
+        <w:t xml:space="preserve">“Erasure qubits: Overcoming the</w:t>
+      </w:r>
+      <w:r>
+        <w:t xml:space="preserve"> </w:t>
+      </w:r>
+      <m:oMath>
+        <m:sSub>
+          <m:e>
+            <m:r>
+              <m:t>T</m:t>
+            </m:r>
+          </m:e>
+          <m:sub>
+            <m:r>
+              <m:t>1</m:t>
+            </m:r>
+          </m:sub>
+        </m:sSub>
+      </m:oMath>
+      <w:r>
+        <w:t xml:space="preserve"> </w:t>
+      </w:r>
+      <w:r>
+        <w:t xml:space="preserve">limit in superconducting circuits,”</w:t>
+      </w:r>
+      <w:r>
+        <w:t xml:space="preserve"> </w:t>
+      </w:r>
+      <w:r>
+        <w:rPr>
+          <w:iCs/>
+          <w:i/>
+        </w:rPr>
+        <w:t xml:space="preserve">Physical Review X</w:t>
+      </w:r>
+      <w:r>
+        <w:t xml:space="preserve">, vol. 13, p. 041022, 2023, doi:</w:t>
+      </w:r>
+      <w:r>
+        <w:t xml:space="preserve"> </w:t>
+      </w:r>
+      <w:hyperlink r:id="rId54">
+        <w:r>
+          <w:rPr>
+            <w:rStyle w:val="Hyperlink"/>
+          </w:rPr>
+          <w:t xml:space="preserve">10.1103/PhysRevX.13.041022</w:t>
+        </w:r>
+      </w:hyperlink>
+      <w:r>
+        <w:t xml:space="preserve">.</w:t>
+      </w:r>
+    </w:p>
+    <w:bookmarkEnd w:id="55"/>
+    <w:bookmarkEnd w:id="56"/>
+    <w:bookmarkEnd w:id="57"/>
     <w:sectPr>
       <w:footerReference w:type="default" r:id="rId9"/>
       <w:pgSz w:w="11906" w:h="16838"/>

</xml_diff>